<commit_message>
Correcties na technische verificatie
H21 S-metertabel pW-kolom: systematische factor ×100 fout gecorrigeerd
  S9: 5000 pW → 50 pW (correct: 50 pW bij 50µV/50Ω = -73 dBm)
  Alle S1-S9+30 waarden gecorrigeerd

H18 kabelverlies: inconsistentie met H19 opgelost
  '2-3 dB voor 10m RG-58 op 145 MHz' → '1-1,5 dB' (consistent met H19)

H19 RG-58 waarden: realistischer
  145 MHz: 7 → 10 dB/100m (ARRL Handbook: 12-15 dB/100m voor RG-58)
  435 MHz: 13 → 18 dB/100m

Spiekfiche + Word DOCX + PDF: zelfde correcties toegepast
Word validatie: All validations PASSED
</commit_message>
<xml_diff>
--- a/downloads/WLD-ON6WL-dBdBm-Handboek-v1.docx
+++ b/downloads/WLD-ON6WL-dBdBm-Handboek-v1.docx
@@ -1044,6 +1044,7 @@
           <w:sz w:val="20"/>
           <w:szCs w:val="20"/>
           <w:highlight w:val="cyan"/>
+          <w:highlightCs w:val="cyan"/>
         </w:rPr>
         <w:t xml:space="preserve">0.1  </w:t>
       </w:r>
@@ -1105,6 +1106,7 @@
           <w:sz w:val="20"/>
           <w:szCs w:val="20"/>
           <w:highlight w:val="cyan"/>
+          <w:highlightCs w:val="cyan"/>
         </w:rPr>
         <w:t xml:space="preserve">0.2  </w:t>
       </w:r>
@@ -2159,6 +2161,7 @@
           <w:sz w:val="20"/>
           <w:szCs w:val="20"/>
           <w:highlight w:val="cyan"/>
+          <w:highlightCs w:val="cyan"/>
         </w:rPr>
         <w:t xml:space="preserve">0.3  </w:t>
       </w:r>
@@ -3722,6 +3725,7 @@
           <w:sz w:val="20"/>
           <w:szCs w:val="20"/>
           <w:highlight w:val="cyan"/>
+          <w:highlightCs w:val="cyan"/>
         </w:rPr>
         <w:t xml:space="preserve">1.1  </w:t>
       </w:r>
@@ -3963,6 +3967,7 @@
           <w:sz w:val="20"/>
           <w:szCs w:val="20"/>
           <w:highlight w:val="cyan"/>
+          <w:highlightCs w:val="cyan"/>
         </w:rPr>
         <w:t xml:space="preserve">1.2  </w:t>
       </w:r>
@@ -4789,6 +4794,7 @@
           <w:sz w:val="20"/>
           <w:szCs w:val="20"/>
           <w:highlight w:val="cyan"/>
+          <w:highlightCs w:val="cyan"/>
         </w:rPr>
         <w:t xml:space="preserve">1.3  </w:t>
       </w:r>
@@ -5305,6 +5311,7 @@
           <w:sz w:val="20"/>
           <w:szCs w:val="20"/>
           <w:highlight w:val="cyan"/>
+          <w:highlightCs w:val="cyan"/>
         </w:rPr>
         <w:t xml:space="preserve">2.1  </w:t>
       </w:r>
@@ -5547,6 +5554,7 @@
           <w:sz w:val="20"/>
           <w:szCs w:val="20"/>
           <w:highlight w:val="cyan"/>
+          <w:highlightCs w:val="cyan"/>
         </w:rPr>
         <w:t xml:space="preserve">2.2  </w:t>
       </w:r>
@@ -5879,6 +5887,7 @@
           <w:sz w:val="20"/>
           <w:szCs w:val="20"/>
           <w:highlight w:val="cyan"/>
+          <w:highlightCs w:val="cyan"/>
         </w:rPr>
         <w:t xml:space="preserve">2.3  </w:t>
       </w:r>
@@ -7241,6 +7250,7 @@
           <w:sz w:val="20"/>
           <w:szCs w:val="20"/>
           <w:highlight w:val="cyan"/>
+          <w:highlightCs w:val="cyan"/>
         </w:rPr>
         <w:t xml:space="preserve">2.4  </w:t>
       </w:r>
@@ -7731,6 +7741,7 @@
           <w:sz w:val="20"/>
           <w:szCs w:val="20"/>
           <w:highlight w:val="cyan"/>
+          <w:highlightCs w:val="cyan"/>
         </w:rPr>
         <w:t xml:space="preserve">3.1  </w:t>
       </w:r>
@@ -9285,6 +9296,7 @@
           <w:sz w:val="20"/>
           <w:szCs w:val="20"/>
           <w:highlight w:val="cyan"/>
+          <w:highlightCs w:val="cyan"/>
         </w:rPr>
         <w:t xml:space="preserve">3.2  </w:t>
       </w:r>
@@ -9721,6 +9733,7 @@
           <w:sz w:val="20"/>
           <w:szCs w:val="20"/>
           <w:highlight w:val="cyan"/>
+          <w:highlightCs w:val="cyan"/>
         </w:rPr>
         <w:t xml:space="preserve">4.1  </w:t>
       </w:r>
@@ -9788,6 +9801,7 @@
           <w:sz w:val="20"/>
           <w:szCs w:val="20"/>
           <w:highlight w:val="cyan"/>
+          <w:highlightCs w:val="cyan"/>
         </w:rPr>
         <w:t xml:space="preserve">4.2  </w:t>
       </w:r>
@@ -10091,6 +10105,7 @@
           <w:sz w:val="20"/>
           <w:szCs w:val="20"/>
           <w:highlight w:val="cyan"/>
+          <w:highlightCs w:val="cyan"/>
         </w:rPr>
         <w:t xml:space="preserve">4.3  </w:t>
       </w:r>
@@ -10136,6 +10151,7 @@
           <w:sz w:val="20"/>
           <w:szCs w:val="20"/>
           <w:highlight w:val="cyan"/>
+          <w:highlightCs w:val="cyan"/>
         </w:rPr>
         <w:t xml:space="preserve">4.4  </w:t>
       </w:r>
@@ -11616,6 +11632,7 @@
           <w:sz w:val="20"/>
           <w:szCs w:val="20"/>
           <w:highlight w:val="cyan"/>
+          <w:highlightCs w:val="cyan"/>
         </w:rPr>
         <w:t xml:space="preserve">4.5  </w:t>
       </w:r>
@@ -12078,6 +12095,7 @@
           <w:sz w:val="20"/>
           <w:szCs w:val="20"/>
           <w:highlight w:val="cyan"/>
+          <w:highlightCs w:val="cyan"/>
         </w:rPr>
         <w:t xml:space="preserve">5.1  </w:t>
       </w:r>
@@ -12224,6 +12242,7 @@
           <w:sz w:val="20"/>
           <w:szCs w:val="20"/>
           <w:highlight w:val="cyan"/>
+          <w:highlightCs w:val="cyan"/>
         </w:rPr>
         <w:t xml:space="preserve">5.2  </w:t>
       </w:r>
@@ -12714,6 +12733,7 @@
           <w:sz w:val="20"/>
           <w:szCs w:val="20"/>
           <w:highlight w:val="cyan"/>
+          <w:highlightCs w:val="cyan"/>
         </w:rPr>
         <w:t xml:space="preserve">6.1  </w:t>
       </w:r>
@@ -13547,6 +13567,7 @@
           <w:sz w:val="20"/>
           <w:szCs w:val="20"/>
           <w:highlight w:val="cyan"/>
+          <w:highlightCs w:val="cyan"/>
         </w:rPr>
         <w:t xml:space="preserve">6.2  </w:t>
       </w:r>
@@ -13983,6 +14004,7 @@
           <w:sz w:val="20"/>
           <w:szCs w:val="20"/>
           <w:highlight w:val="cyan"/>
+          <w:highlightCs w:val="cyan"/>
         </w:rPr>
         <w:t xml:space="preserve">7.1  </w:t>
       </w:r>
@@ -14665,6 +14687,7 @@
           <w:sz w:val="20"/>
           <w:szCs w:val="20"/>
           <w:highlight w:val="cyan"/>
+          <w:highlightCs w:val="cyan"/>
         </w:rPr>
         <w:t xml:space="preserve">7.2  </w:t>
       </w:r>
@@ -14915,6 +14938,7 @@
           <w:sz w:val="20"/>
           <w:szCs w:val="20"/>
           <w:highlight w:val="cyan"/>
+          <w:highlightCs w:val="cyan"/>
         </w:rPr>
         <w:t xml:space="preserve">7.3  </w:t>
       </w:r>
@@ -15325,6 +15349,7 @@
           <w:sz w:val="20"/>
           <w:szCs w:val="20"/>
           <w:highlight w:val="cyan"/>
+          <w:highlightCs w:val="cyan"/>
         </w:rPr>
         <w:t xml:space="preserve">8.1  </w:t>
       </w:r>
@@ -16105,6 +16130,7 @@
           <w:sz w:val="20"/>
           <w:szCs w:val="20"/>
           <w:highlight w:val="cyan"/>
+          <w:highlightCs w:val="cyan"/>
         </w:rPr>
         <w:t xml:space="preserve">8.2  </w:t>
       </w:r>
@@ -16989,6 +17015,7 @@
           <w:sz w:val="20"/>
           <w:szCs w:val="20"/>
           <w:highlight w:val="cyan"/>
+          <w:highlightCs w:val="cyan"/>
         </w:rPr>
         <w:t xml:space="preserve">8.3  </w:t>
       </w:r>
@@ -17345,6 +17372,7 @@
           <w:sz w:val="20"/>
           <w:szCs w:val="20"/>
           <w:highlight w:val="cyan"/>
+          <w:highlightCs w:val="cyan"/>
         </w:rPr>
         <w:t xml:space="preserve">9.1  </w:t>
       </w:r>
@@ -18575,6 +18603,7 @@
           <w:sz w:val="20"/>
           <w:szCs w:val="20"/>
           <w:highlight w:val="cyan"/>
+          <w:highlightCs w:val="cyan"/>
         </w:rPr>
         <w:t xml:space="preserve">9.2  </w:t>
       </w:r>
@@ -19479,6 +19508,7 @@
           <w:sz w:val="20"/>
           <w:szCs w:val="20"/>
           <w:highlight w:val="cyan"/>
+          <w:highlightCs w:val="cyan"/>
         </w:rPr>
         <w:t xml:space="preserve">9.3  </w:t>
       </w:r>
@@ -19969,6 +19999,7 @@
           <w:sz w:val="20"/>
           <w:szCs w:val="20"/>
           <w:highlight w:val="cyan"/>
+          <w:highlightCs w:val="cyan"/>
         </w:rPr>
         <w:t xml:space="preserve">10.1  </w:t>
       </w:r>
@@ -20206,6 +20237,7 @@
           <w:sz w:val="20"/>
           <w:szCs w:val="20"/>
           <w:highlight w:val="cyan"/>
+          <w:highlightCs w:val="cyan"/>
         </w:rPr>
         <w:t xml:space="preserve">10.2  </w:t>
       </w:r>
@@ -21245,7 +21277,7 @@
                 <w:sz w:val="20"/>
                 <w:szCs w:val="20"/>
               </w:rPr>
-              <w:t xml:space="preserve">5 000 mW</w:t>
+              <w:t xml:space="preserve">50 mW</w:t>
             </w:r>
           </w:p>
         </w:tc>
@@ -21509,7 +21541,7 @@
                 <w:sz w:val="20"/>
                 <w:szCs w:val="20"/>
               </w:rPr>
-              <w:t xml:space="preserve">50 000 mW</w:t>
+              <w:t xml:space="preserve">501 mW</w:t>
             </w:r>
           </w:p>
         </w:tc>
@@ -21862,6 +21894,7 @@
           <w:sz w:val="20"/>
           <w:szCs w:val="20"/>
           <w:highlight w:val="cyan"/>
+          <w:highlightCs w:val="cyan"/>
         </w:rPr>
         <w:t xml:space="preserve">10.3  </w:t>
       </w:r>
@@ -22624,6 +22657,7 @@
           <w:sz w:val="20"/>
           <w:szCs w:val="20"/>
           <w:highlight w:val="cyan"/>
+          <w:highlightCs w:val="cyan"/>
         </w:rPr>
         <w:t xml:space="preserve">10.4  </w:t>
       </w:r>
@@ -23140,6 +23174,7 @@
           <w:sz w:val="20"/>
           <w:szCs w:val="20"/>
           <w:highlight w:val="cyan"/>
+          <w:highlightCs w:val="cyan"/>
         </w:rPr>
         <w:t xml:space="preserve">11.1  </w:t>
       </w:r>
@@ -23417,6 +23452,7 @@
           <w:sz w:val="20"/>
           <w:szCs w:val="20"/>
           <w:highlight w:val="cyan"/>
+          <w:highlightCs w:val="cyan"/>
         </w:rPr>
         <w:t xml:space="preserve">11.2  </w:t>
       </w:r>
@@ -24977,6 +25013,7 @@
           <w:sz w:val="20"/>
           <w:szCs w:val="20"/>
           <w:highlight w:val="cyan"/>
+          <w:highlightCs w:val="cyan"/>
         </w:rPr>
         <w:t xml:space="preserve">11.3  </w:t>
       </w:r>
@@ -25413,6 +25450,7 @@
           <w:sz w:val="20"/>
           <w:szCs w:val="20"/>
           <w:highlight w:val="cyan"/>
+          <w:highlightCs w:val="cyan"/>
         </w:rPr>
         <w:t xml:space="preserve">12.1  </w:t>
       </w:r>
@@ -26480,6 +26518,7 @@
           <w:sz w:val="20"/>
           <w:szCs w:val="20"/>
           <w:highlight w:val="cyan"/>
+          <w:highlightCs w:val="cyan"/>
         </w:rPr>
         <w:t xml:space="preserve">13.1  </w:t>
       </w:r>
@@ -27926,6 +27965,7 @@
           <w:sz w:val="20"/>
           <w:szCs w:val="20"/>
           <w:highlight w:val="cyan"/>
+          <w:highlightCs w:val="cyan"/>
         </w:rPr>
         <w:t xml:space="preserve">14.1  </w:t>
       </w:r>
@@ -28768,6 +28808,7 @@
           <w:sz w:val="20"/>
           <w:szCs w:val="20"/>
           <w:highlight w:val="cyan"/>
+          <w:highlightCs w:val="cyan"/>
         </w:rPr>
         <w:t xml:space="preserve">14.2  </w:t>
       </w:r>
@@ -29205,6 +29246,7 @@
           <w:sz w:val="20"/>
           <w:szCs w:val="20"/>
           <w:highlight w:val="cyan"/>
+          <w:highlightCs w:val="cyan"/>
         </w:rPr>
         <w:t xml:space="preserve">15.1  </w:t>
       </w:r>
@@ -30673,6 +30715,7 @@
           <w:sz w:val="20"/>
           <w:szCs w:val="20"/>
           <w:highlight w:val="cyan"/>
+          <w:highlightCs w:val="cyan"/>
         </w:rPr>
         <w:t xml:space="preserve">16.1  </w:t>
       </w:r>
@@ -30932,6 +30975,7 @@
           <w:sz w:val="20"/>
           <w:szCs w:val="20"/>
           <w:highlight w:val="cyan"/>
+          <w:highlightCs w:val="cyan"/>
         </w:rPr>
         <w:t xml:space="preserve">16.2  </w:t>
       </w:r>
@@ -31342,6 +31386,7 @@
           <w:sz w:val="20"/>
           <w:szCs w:val="20"/>
           <w:highlight w:val="cyan"/>
+          <w:highlightCs w:val="cyan"/>
         </w:rPr>
         <w:t xml:space="preserve">17.1  </w:t>
       </w:r>
@@ -31556,6 +31601,7 @@
           <w:sz w:val="20"/>
           <w:szCs w:val="20"/>
           <w:highlight w:val="cyan"/>
+          <w:highlightCs w:val="cyan"/>
         </w:rPr>
         <w:t xml:space="preserve">17.2  </w:t>
       </w:r>
@@ -32721,6 +32767,7 @@
           <w:sz w:val="20"/>
           <w:szCs w:val="20"/>
           <w:highlight w:val="cyan"/>
+          <w:highlightCs w:val="cyan"/>
         </w:rPr>
         <w:t xml:space="preserve">18.1  </w:t>
       </w:r>
@@ -33433,6 +33480,7 @@
           <w:sz w:val="20"/>
           <w:szCs w:val="20"/>
           <w:highlight w:val="cyan"/>
+          <w:highlightCs w:val="cyan"/>
         </w:rPr>
         <w:t xml:space="preserve">18.2  </w:t>
       </w:r>
@@ -33815,6 +33863,7 @@
           <w:sz w:val="20"/>
           <w:szCs w:val="20"/>
           <w:highlight w:val="cyan"/>
+          <w:highlightCs w:val="cyan"/>
         </w:rPr>
         <w:t xml:space="preserve">19.1  </w:t>
       </w:r>
@@ -34094,7 +34143,7 @@
                 <w:sz w:val="20"/>
                 <w:szCs w:val="20"/>
               </w:rPr>
-              <w:t xml:space="preserve">≈7 dB/100m</w:t>
+              <w:t xml:space="preserve">≈10 dB/100m</w:t>
             </w:r>
           </w:p>
         </w:tc>
@@ -34128,7 +34177,7 @@
                 <w:sz w:val="20"/>
                 <w:szCs w:val="20"/>
               </w:rPr>
-              <w:t xml:space="preserve">≈13 dB/100m</w:t>
+              <w:t xml:space="preserve">≈18 dB/100m</w:t>
             </w:r>
           </w:p>
         </w:tc>
@@ -34779,6 +34828,7 @@
           <w:sz w:val="20"/>
           <w:szCs w:val="20"/>
           <w:highlight w:val="cyan"/>
+          <w:highlightCs w:val="cyan"/>
         </w:rPr>
         <w:t xml:space="preserve">19.2  </w:t>
       </w:r>
@@ -35215,6 +35265,7 @@
           <w:sz w:val="20"/>
           <w:szCs w:val="20"/>
           <w:highlight w:val="cyan"/>
+          <w:highlightCs w:val="cyan"/>
         </w:rPr>
         <w:t xml:space="preserve">20.1  </w:t>
       </w:r>
@@ -36225,6 +36276,7 @@
           <w:sz w:val="20"/>
           <w:szCs w:val="20"/>
           <w:highlight w:val="cyan"/>
+          <w:highlightCs w:val="cyan"/>
         </w:rPr>
         <w:t xml:space="preserve">20.2  </w:t>
       </w:r>
@@ -37237,6 +37289,7 @@
           <w:sz w:val="20"/>
           <w:szCs w:val="20"/>
           <w:highlight w:val="cyan"/>
+          <w:highlightCs w:val="cyan"/>
         </w:rPr>
         <w:t xml:space="preserve">20.3  </w:t>
       </w:r>
@@ -37618,6 +37671,7 @@
           <w:sz w:val="20"/>
           <w:szCs w:val="20"/>
           <w:highlight w:val="cyan"/>
+          <w:highlightCs w:val="cyan"/>
         </w:rPr>
         <w:t xml:space="preserve">21.1  </w:t>
       </w:r>
@@ -37795,6 +37849,7 @@
           <w:sz w:val="20"/>
           <w:szCs w:val="20"/>
           <w:highlight w:val="cyan"/>
+          <w:highlightCs w:val="cyan"/>
         </w:rPr>
         <w:t xml:space="preserve">21.2  </w:t>
       </w:r>
@@ -39780,7 +39835,7 @@
                 <w:sz w:val="20"/>
                 <w:szCs w:val="20"/>
               </w:rPr>
-              <w:t xml:space="preserve">500 000</w:t>
+              <w:t xml:space="preserve">5 012</w:t>
             </w:r>
           </w:p>
         </w:tc>
@@ -39944,7 +39999,7 @@
                 <w:sz w:val="20"/>
                 <w:szCs w:val="20"/>
               </w:rPr>
-              <w:t xml:space="preserve">5 000 000</w:t>
+              <w:t xml:space="preserve">50 119</w:t>
             </w:r>
           </w:p>
         </w:tc>
@@ -40209,6 +40264,7 @@
           <w:sz w:val="20"/>
           <w:szCs w:val="20"/>
           <w:highlight w:val="cyan"/>
+          <w:highlightCs w:val="cyan"/>
         </w:rPr>
         <w:t xml:space="preserve">21.3  </w:t>
       </w:r>
@@ -40645,6 +40701,7 @@
           <w:sz w:val="20"/>
           <w:szCs w:val="20"/>
           <w:highlight w:val="cyan"/>
+          <w:highlightCs w:val="cyan"/>
         </w:rPr>
         <w:t xml:space="preserve">22.1  </w:t>
       </w:r>
@@ -40860,6 +40917,7 @@
           <w:sz w:val="20"/>
           <w:szCs w:val="20"/>
           <w:highlight w:val="cyan"/>
+          <w:highlightCs w:val="cyan"/>
         </w:rPr>
         <w:t xml:space="preserve">22.2  </w:t>
       </w:r>
@@ -41244,6 +41302,7 @@
           <w:sz w:val="20"/>
           <w:szCs w:val="20"/>
           <w:highlight w:val="cyan"/>
+          <w:highlightCs w:val="cyan"/>
         </w:rPr>
         <w:t xml:space="preserve">23.1  </w:t>
       </w:r>
@@ -42132,6 +42191,7 @@
           <w:sz w:val="20"/>
           <w:szCs w:val="20"/>
           <w:highlight w:val="cyan"/>
+          <w:highlightCs w:val="cyan"/>
         </w:rPr>
         <w:t xml:space="preserve">23.2  </w:t>
       </w:r>
@@ -42569,6 +42629,7 @@
           <w:sz w:val="20"/>
           <w:szCs w:val="20"/>
           <w:highlight w:val="cyan"/>
+          <w:highlightCs w:val="cyan"/>
         </w:rPr>
         <w:t xml:space="preserve">24.1  </w:t>
       </w:r>
@@ -43529,6 +43590,7 @@
           <w:sz w:val="20"/>
           <w:szCs w:val="20"/>
           <w:highlight w:val="cyan"/>
+          <w:highlightCs w:val="cyan"/>
         </w:rPr>
         <w:t xml:space="preserve">24.2  </w:t>
       </w:r>
@@ -43987,6 +44049,7 @@
           <w:sz w:val="20"/>
           <w:szCs w:val="20"/>
           <w:highlight w:val="cyan"/>
+          <w:highlightCs w:val="cyan"/>
         </w:rPr>
         <w:t xml:space="preserve">25.1  </w:t>
       </w:r>
@@ -45299,6 +45362,7 @@
           <w:sz w:val="20"/>
           <w:szCs w:val="20"/>
           <w:highlight w:val="cyan"/>
+          <w:highlightCs w:val="cyan"/>
         </w:rPr>
         <w:t xml:space="preserve">25.2  </w:t>
       </w:r>
@@ -45709,6 +45773,7 @@
           <w:sz w:val="20"/>
           <w:szCs w:val="20"/>
           <w:highlight w:val="cyan"/>
+          <w:highlightCs w:val="cyan"/>
         </w:rPr>
         <w:t xml:space="preserve">26.1  </w:t>
       </w:r>
@@ -46969,6 +47034,7 @@
           <w:sz w:val="20"/>
           <w:szCs w:val="20"/>
           <w:highlight w:val="cyan"/>
+          <w:highlightCs w:val="cyan"/>
         </w:rPr>
         <w:t xml:space="preserve">26.2  </w:t>
       </w:r>
@@ -47262,6 +47328,7 @@
           <w:sz w:val="20"/>
           <w:szCs w:val="20"/>
           <w:highlight w:val="cyan"/>
+          <w:highlightCs w:val="cyan"/>
         </w:rPr>
         <w:t xml:space="preserve">26.3  </w:t>
       </w:r>
@@ -48285,6 +48352,7 @@
           <w:sz w:val="20"/>
           <w:szCs w:val="20"/>
           <w:highlight w:val="cyan"/>
+          <w:highlightCs w:val="cyan"/>
         </w:rPr>
         <w:t xml:space="preserve">28.1  </w:t>
       </w:r>
@@ -48513,6 +48581,7 @@
           <w:sz w:val="20"/>
           <w:szCs w:val="20"/>
           <w:highlight w:val="cyan"/>
+          <w:highlightCs w:val="cyan"/>
         </w:rPr>
         <w:t xml:space="preserve">28.2  </w:t>
       </w:r>
@@ -49975,6 +50044,7 @@
           <w:sz w:val="20"/>
           <w:szCs w:val="20"/>
           <w:highlight w:val="cyan"/>
+          <w:highlightCs w:val="cyan"/>
         </w:rPr>
         <w:t xml:space="preserve">28.3  </w:t>
       </w:r>

</xml_diff>